<commit_message>
simulated D5 and D6 generated
</commit_message>
<xml_diff>
--- a/i_test/test_D6_Table_1/g_output/D6_Table_1_cohort_characteristics_GLP1RA.docx
+++ b/i_test/test_D6_Table_1/g_output/D6_Table_1_cohort_characteristics_GLP1RA.docx
@@ -231,87 +231,87 @@
               <w:pStyle w:val="Normal"/>
             </w:pPr>
             <w:r>
-              <w:t>104</w:t>
-            </w:r>
-          </w:p>
-        </w:tc>
-        <w:tc>
-          <w:p>
-            <w:pPr>
-              <w:pStyle w:val="Normal"/>
-            </w:pPr>
-            <w:r>
-              <w:t>115</w:t>
-            </w:r>
-          </w:p>
-        </w:tc>
-        <w:tc>
-          <w:p>
-            <w:pPr>
-              <w:pStyle w:val="Normal"/>
-            </w:pPr>
-            <w:r>
-              <w:t>100</w:t>
-            </w:r>
-          </w:p>
-        </w:tc>
-        <w:tc>
-          <w:p>
-            <w:pPr>
-              <w:pStyle w:val="Normal"/>
-            </w:pPr>
-            <w:r>
-              <w:t>106</w:t>
-            </w:r>
-          </w:p>
-        </w:tc>
-        <w:tc>
-          <w:p>
-            <w:pPr>
-              <w:pStyle w:val="Normal"/>
-            </w:pPr>
-            <w:r>
-              <w:t>88</w:t>
-            </w:r>
-          </w:p>
-        </w:tc>
-        <w:tc>
-          <w:p>
-            <w:pPr>
-              <w:pStyle w:val="Normal"/>
-            </w:pPr>
-            <w:r>
-              <w:t>93</w:t>
-            </w:r>
-          </w:p>
-        </w:tc>
-        <w:tc>
-          <w:p>
-            <w:pPr>
-              <w:pStyle w:val="Normal"/>
-            </w:pPr>
-            <w:r>
-              <w:t>94</w:t>
-            </w:r>
-          </w:p>
-        </w:tc>
-        <w:tc>
-          <w:p>
-            <w:pPr>
-              <w:pStyle w:val="Normal"/>
-            </w:pPr>
-            <w:r>
-              <w:t>91</w:t>
-            </w:r>
-          </w:p>
-        </w:tc>
-        <w:tc>
-          <w:p>
-            <w:pPr>
-              <w:pStyle w:val="Normal"/>
-            </w:pPr>
-            <w:r>
-              <w:t>95</w:t>
+              <w:t>565</w:t>
+            </w:r>
+          </w:p>
+        </w:tc>
+        <w:tc>
+          <w:p>
+            <w:pPr>
+              <w:pStyle w:val="Normal"/>
+            </w:pPr>
+            <w:r>
+              <w:t>550</w:t>
+            </w:r>
+          </w:p>
+        </w:tc>
+        <w:tc>
+          <w:p>
+            <w:pPr>
+              <w:pStyle w:val="Normal"/>
+            </w:pPr>
+            <w:r>
+              <w:t>536</w:t>
+            </w:r>
+          </w:p>
+        </w:tc>
+        <w:tc>
+          <w:p>
+            <w:pPr>
+              <w:pStyle w:val="Normal"/>
+            </w:pPr>
+            <w:r>
+              <w:t>590</w:t>
+            </w:r>
+          </w:p>
+        </w:tc>
+        <w:tc>
+          <w:p>
+            <w:pPr>
+              <w:pStyle w:val="Normal"/>
+            </w:pPr>
+            <w:r>
+              <w:t>544</w:t>
+            </w:r>
+          </w:p>
+        </w:tc>
+        <w:tc>
+          <w:p>
+            <w:pPr>
+              <w:pStyle w:val="Normal"/>
+            </w:pPr>
+            <w:r>
+              <w:t>548</w:t>
+            </w:r>
+          </w:p>
+        </w:tc>
+        <w:tc>
+          <w:p>
+            <w:pPr>
+              <w:pStyle w:val="Normal"/>
+            </w:pPr>
+            <w:r>
+              <w:t>574</w:t>
+            </w:r>
+          </w:p>
+        </w:tc>
+        <w:tc>
+          <w:p>
+            <w:pPr>
+              <w:pStyle w:val="Normal"/>
+            </w:pPr>
+            <w:r>
+              <w:t>511</w:t>
+            </w:r>
+          </w:p>
+        </w:tc>
+        <w:tc>
+          <w:p>
+            <w:pPr>
+              <w:pStyle w:val="Normal"/>
+            </w:pPr>
+            <w:r>
+              <w:t>582</w:t>
             </w:r>
           </w:p>
         </w:tc>
@@ -435,87 +435,87 @@
               <w:pStyle w:val="Normal"/>
             </w:pPr>
             <w:r>
-              <w:t>49 (39.5 - 62.25)</w:t>
-            </w:r>
-          </w:p>
-        </w:tc>
-        <w:tc>
-          <w:p>
-            <w:pPr>
-              <w:pStyle w:val="Normal"/>
-            </w:pPr>
-            <w:r>
-              <w:t>53 (42.5 - 60.5)</w:t>
-            </w:r>
-          </w:p>
-        </w:tc>
-        <w:tc>
-          <w:p>
-            <w:pPr>
-              <w:pStyle w:val="Normal"/>
-            </w:pPr>
-            <w:r>
-              <w:t>49 (40 - 61)</w:t>
-            </w:r>
-          </w:p>
-        </w:tc>
-        <w:tc>
-          <w:p>
-            <w:pPr>
-              <w:pStyle w:val="Normal"/>
-            </w:pPr>
-            <w:r>
-              <w:t>47 (38 - 57.75)</w:t>
-            </w:r>
-          </w:p>
-        </w:tc>
-        <w:tc>
-          <w:p>
-            <w:pPr>
-              <w:pStyle w:val="Normal"/>
-            </w:pPr>
-            <w:r>
-              <w:t>52 (41.75 - 60)</w:t>
-            </w:r>
-          </w:p>
-        </w:tc>
-        <w:tc>
-          <w:p>
-            <w:pPr>
-              <w:pStyle w:val="Normal"/>
-            </w:pPr>
-            <w:r>
-              <w:t>51 (43 - 61)</w:t>
-            </w:r>
-          </w:p>
-        </w:tc>
-        <w:tc>
-          <w:p>
-            <w:pPr>
-              <w:pStyle w:val="Normal"/>
-            </w:pPr>
-            <w:r>
-              <w:t>53.5 (41.25 - 60.75)</w:t>
-            </w:r>
-          </w:p>
-        </w:tc>
-        <w:tc>
-          <w:p>
-            <w:pPr>
-              <w:pStyle w:val="Normal"/>
-            </w:pPr>
-            <w:r>
-              <w:t>53 (46 - 63.5)</w:t>
-            </w:r>
-          </w:p>
-        </w:tc>
-        <w:tc>
-          <w:p>
-            <w:pPr>
-              <w:pStyle w:val="Normal"/>
-            </w:pPr>
-            <w:r>
-              <w:t>47 (41 - 60.5)</w:t>
+              <w:t>50 (40 - 59)</w:t>
+            </w:r>
+          </w:p>
+        </w:tc>
+        <w:tc>
+          <w:p>
+            <w:pPr>
+              <w:pStyle w:val="Normal"/>
+            </w:pPr>
+            <w:r>
+              <w:t>50 (39 - 60)</w:t>
+            </w:r>
+          </w:p>
+        </w:tc>
+        <w:tc>
+          <w:p>
+            <w:pPr>
+              <w:pStyle w:val="Normal"/>
+            </w:pPr>
+            <w:r>
+              <w:t>50 (39 - 60)</w:t>
+            </w:r>
+          </w:p>
+        </w:tc>
+        <w:tc>
+          <w:p>
+            <w:pPr>
+              <w:pStyle w:val="Normal"/>
+            </w:pPr>
+            <w:r>
+              <w:t>51 (40 - 61.75)</w:t>
+            </w:r>
+          </w:p>
+        </w:tc>
+        <w:tc>
+          <w:p>
+            <w:pPr>
+              <w:pStyle w:val="Normal"/>
+            </w:pPr>
+            <w:r>
+              <w:t>51 (41 - 60.25)</w:t>
+            </w:r>
+          </w:p>
+        </w:tc>
+        <w:tc>
+          <w:p>
+            <w:pPr>
+              <w:pStyle w:val="Normal"/>
+            </w:pPr>
+            <w:r>
+              <w:t>50 (41 - 62)</w:t>
+            </w:r>
+          </w:p>
+        </w:tc>
+        <w:tc>
+          <w:p>
+            <w:pPr>
+              <w:pStyle w:val="Normal"/>
+            </w:pPr>
+            <w:r>
+              <w:t>50.5 (41 - 61)</w:t>
+            </w:r>
+          </w:p>
+        </w:tc>
+        <w:tc>
+          <w:p>
+            <w:pPr>
+              <w:pStyle w:val="Normal"/>
+            </w:pPr>
+            <w:r>
+              <w:t>50 (40 - 61)</w:t>
+            </w:r>
+          </w:p>
+        </w:tc>
+        <w:tc>
+          <w:p>
+            <w:pPr>
+              <w:pStyle w:val="Normal"/>
+            </w:pPr>
+            <w:r>
+              <w:t>51 (42 - 59)</w:t>
             </w:r>
           </w:p>
         </w:tc>
@@ -639,87 +639,87 @@
               <w:pStyle w:val="Normal"/>
             </w:pPr>
             <w:r>
-              <w:t>44 (42,3%)</w:t>
-            </w:r>
-          </w:p>
-        </w:tc>
-        <w:tc>
-          <w:p>
-            <w:pPr>
-              <w:pStyle w:val="Normal"/>
-            </w:pPr>
-            <w:r>
-              <w:t>34 (29,6%)</w:t>
-            </w:r>
-          </w:p>
-        </w:tc>
-        <w:tc>
-          <w:p>
-            <w:pPr>
-              <w:pStyle w:val="Normal"/>
-            </w:pPr>
-            <w:r>
-              <w:t>39 (39,0%)</w:t>
-            </w:r>
-          </w:p>
-        </w:tc>
-        <w:tc>
-          <w:p>
-            <w:pPr>
-              <w:pStyle w:val="Normal"/>
-            </w:pPr>
-            <w:r>
-              <w:t>45 (42,5%)</w:t>
-            </w:r>
-          </w:p>
-        </w:tc>
-        <w:tc>
-          <w:p>
-            <w:pPr>
-              <w:pStyle w:val="Normal"/>
-            </w:pPr>
-            <w:r>
-              <w:t>28 (31,8%)</w:t>
-            </w:r>
-          </w:p>
-        </w:tc>
-        <w:tc>
-          <w:p>
-            <w:pPr>
-              <w:pStyle w:val="Normal"/>
-            </w:pPr>
-            <w:r>
-              <w:t>26 (28,0%)</w:t>
-            </w:r>
-          </w:p>
-        </w:tc>
-        <w:tc>
-          <w:p>
-            <w:pPr>
-              <w:pStyle w:val="Normal"/>
-            </w:pPr>
-            <w:r>
-              <w:t>27 (28,7%)</w:t>
-            </w:r>
-          </w:p>
-        </w:tc>
-        <w:tc>
-          <w:p>
-            <w:pPr>
-              <w:pStyle w:val="Normal"/>
-            </w:pPr>
-            <w:r>
-              <w:t>21 (23,1%)</w:t>
-            </w:r>
-          </w:p>
-        </w:tc>
-        <w:tc>
-          <w:p>
-            <w:pPr>
-              <w:pStyle w:val="Normal"/>
-            </w:pPr>
-            <w:r>
-              <w:t>41 (43,2%)</w:t>
+              <w:t>195 (34,5%)</w:t>
+            </w:r>
+          </w:p>
+        </w:tc>
+        <w:tc>
+          <w:p>
+            <w:pPr>
+              <w:pStyle w:val="Normal"/>
+            </w:pPr>
+            <w:r>
+              <w:t>201 (36,5%)</w:t>
+            </w:r>
+          </w:p>
+        </w:tc>
+        <w:tc>
+          <w:p>
+            <w:pPr>
+              <w:pStyle w:val="Normal"/>
+            </w:pPr>
+            <w:r>
+              <w:t>194 (36,2%)</w:t>
+            </w:r>
+          </w:p>
+        </w:tc>
+        <w:tc>
+          <w:p>
+            <w:pPr>
+              <w:pStyle w:val="Normal"/>
+            </w:pPr>
+            <w:r>
+              <w:t>203 (34,4%)</w:t>
+            </w:r>
+          </w:p>
+        </w:tc>
+        <w:tc>
+          <w:p>
+            <w:pPr>
+              <w:pStyle w:val="Normal"/>
+            </w:pPr>
+            <w:r>
+              <w:t>187 (34,4%)</w:t>
+            </w:r>
+          </w:p>
+        </w:tc>
+        <w:tc>
+          <w:p>
+            <w:pPr>
+              <w:pStyle w:val="Normal"/>
+            </w:pPr>
+            <w:r>
+              <w:t>195 (35,6%)</w:t>
+            </w:r>
+          </w:p>
+        </w:tc>
+        <w:tc>
+          <w:p>
+            <w:pPr>
+              <w:pStyle w:val="Normal"/>
+            </w:pPr>
+            <w:r>
+              <w:t>188 (32,8%)</w:t>
+            </w:r>
+          </w:p>
+        </w:tc>
+        <w:tc>
+          <w:p>
+            <w:pPr>
+              <w:pStyle w:val="Normal"/>
+            </w:pPr>
+            <w:r>
+              <w:t>182 (35,6%)</w:t>
+            </w:r>
+          </w:p>
+        </w:tc>
+        <w:tc>
+          <w:p>
+            <w:pPr>
+              <w:pStyle w:val="Normal"/>
+            </w:pPr>
+            <w:r>
+              <w:t>182 (31,3%)</w:t>
             </w:r>
           </w:p>
         </w:tc>
@@ -741,87 +741,87 @@
               <w:pStyle w:val="Normal"/>
             </w:pPr>
             <w:r>
-              <w:t>38 (36,5%)</w:t>
-            </w:r>
-          </w:p>
-        </w:tc>
-        <w:tc>
-          <w:p>
-            <w:pPr>
-              <w:pStyle w:val="Normal"/>
-            </w:pPr>
-            <w:r>
-              <w:t>63 (54,8%)</w:t>
-            </w:r>
-          </w:p>
-        </w:tc>
-        <w:tc>
-          <w:p>
-            <w:pPr>
-              <w:pStyle w:val="Normal"/>
-            </w:pPr>
-            <w:r>
-              <w:t>46 (46,0%)</w:t>
-            </w:r>
-          </w:p>
-        </w:tc>
-        <w:tc>
-          <w:p>
-            <w:pPr>
-              <w:pStyle w:val="Normal"/>
-            </w:pPr>
-            <w:r>
-              <w:t>47 (44,3%)</w:t>
-            </w:r>
-          </w:p>
-        </w:tc>
-        <w:tc>
-          <w:p>
-            <w:pPr>
-              <w:pStyle w:val="Normal"/>
-            </w:pPr>
-            <w:r>
-              <w:t>51 (58,0%)</w:t>
-            </w:r>
-          </w:p>
-        </w:tc>
-        <w:tc>
-          <w:p>
-            <w:pPr>
-              <w:pStyle w:val="Normal"/>
-            </w:pPr>
-            <w:r>
-              <w:t>50 (53,8%)</w:t>
-            </w:r>
-          </w:p>
-        </w:tc>
-        <w:tc>
-          <w:p>
-            <w:pPr>
-              <w:pStyle w:val="Normal"/>
-            </w:pPr>
-            <w:r>
-              <w:t>48 (51,1%)</w:t>
-            </w:r>
-          </w:p>
-        </w:tc>
-        <w:tc>
-          <w:p>
-            <w:pPr>
-              <w:pStyle w:val="Normal"/>
-            </w:pPr>
-            <w:r>
-              <w:t>50 (54,9%)</w:t>
-            </w:r>
-          </w:p>
-        </w:tc>
-        <w:tc>
-          <w:p>
-            <w:pPr>
-              <w:pStyle w:val="Normal"/>
-            </w:pPr>
-            <w:r>
-              <w:t>34 (35,8%)</w:t>
+              <w:t>283 (50,1%)</w:t>
+            </w:r>
+          </w:p>
+        </w:tc>
+        <w:tc>
+          <w:p>
+            <w:pPr>
+              <w:pStyle w:val="Normal"/>
+            </w:pPr>
+            <w:r>
+              <w:t>258 (46,9%)</w:t>
+            </w:r>
+          </w:p>
+        </w:tc>
+        <w:tc>
+          <w:p>
+            <w:pPr>
+              <w:pStyle w:val="Normal"/>
+            </w:pPr>
+            <w:r>
+              <w:t>252 (47,0%)</w:t>
+            </w:r>
+          </w:p>
+        </w:tc>
+        <w:tc>
+          <w:p>
+            <w:pPr>
+              <w:pStyle w:val="Normal"/>
+            </w:pPr>
+            <w:r>
+              <w:t>282 (47,8%)</w:t>
+            </w:r>
+          </w:p>
+        </w:tc>
+        <w:tc>
+          <w:p>
+            <w:pPr>
+              <w:pStyle w:val="Normal"/>
+            </w:pPr>
+            <w:r>
+              <w:t>266 (48,9%)</w:t>
+            </w:r>
+          </w:p>
+        </w:tc>
+        <w:tc>
+          <w:p>
+            <w:pPr>
+              <w:pStyle w:val="Normal"/>
+            </w:pPr>
+            <w:r>
+              <w:t>250 (45,6%)</w:t>
+            </w:r>
+          </w:p>
+        </w:tc>
+        <w:tc>
+          <w:p>
+            <w:pPr>
+              <w:pStyle w:val="Normal"/>
+            </w:pPr>
+            <w:r>
+              <w:t>283 (49,3%)</w:t>
+            </w:r>
+          </w:p>
+        </w:tc>
+        <w:tc>
+          <w:p>
+            <w:pPr>
+              <w:pStyle w:val="Normal"/>
+            </w:pPr>
+            <w:r>
+              <w:t>246 (48,1%)</w:t>
+            </w:r>
+          </w:p>
+        </w:tc>
+        <w:tc>
+          <w:p>
+            <w:pPr>
+              <w:pStyle w:val="Normal"/>
+            </w:pPr>
+            <w:r>
+              <w:t>313 (53,8%)</w:t>
             </w:r>
           </w:p>
         </w:tc>
@@ -843,87 +843,87 @@
               <w:pStyle w:val="Normal"/>
             </w:pPr>
             <w:r>
-              <w:t>16 (15,4%)</w:t>
-            </w:r>
-          </w:p>
-        </w:tc>
-        <w:tc>
-          <w:p>
-            <w:pPr>
-              <w:pStyle w:val="Normal"/>
-            </w:pPr>
-            <w:r>
-              <w:t>10 (8,7%)</w:t>
-            </w:r>
-          </w:p>
-        </w:tc>
-        <w:tc>
-          <w:p>
-            <w:pPr>
-              <w:pStyle w:val="Normal"/>
-            </w:pPr>
-            <w:r>
-              <w:t>10 (10,0%)</w:t>
-            </w:r>
-          </w:p>
-        </w:tc>
-        <w:tc>
-          <w:p>
-            <w:pPr>
-              <w:pStyle w:val="Normal"/>
-            </w:pPr>
-            <w:r>
-              <w:t>10 (9,4%)</w:t>
-            </w:r>
-          </w:p>
-        </w:tc>
-        <w:tc>
-          <w:p>
-            <w:pPr>
-              <w:pStyle w:val="Normal"/>
-            </w:pPr>
-            <w:r>
-              <w:t>8 (9,1%)</w:t>
-            </w:r>
-          </w:p>
-        </w:tc>
-        <w:tc>
-          <w:p>
-            <w:pPr>
-              <w:pStyle w:val="Normal"/>
-            </w:pPr>
-            <w:r>
-              <w:t>12 (12,9%)</w:t>
-            </w:r>
-          </w:p>
-        </w:tc>
-        <w:tc>
-          <w:p>
-            <w:pPr>
-              <w:pStyle w:val="Normal"/>
-            </w:pPr>
-            <w:r>
-              <w:t>13 (13,8%)</w:t>
-            </w:r>
-          </w:p>
-        </w:tc>
-        <w:tc>
-          <w:p>
-            <w:pPr>
-              <w:pStyle w:val="Normal"/>
-            </w:pPr>
-            <w:r>
-              <w:t>15 (16,5%)</w:t>
-            </w:r>
-          </w:p>
-        </w:tc>
-        <w:tc>
-          <w:p>
-            <w:pPr>
-              <w:pStyle w:val="Normal"/>
-            </w:pPr>
-            <w:r>
-              <w:t>14 (14,7%)</w:t>
+              <w:t>64 (11,3%)</w:t>
+            </w:r>
+          </w:p>
+        </w:tc>
+        <w:tc>
+          <w:p>
+            <w:pPr>
+              <w:pStyle w:val="Normal"/>
+            </w:pPr>
+            <w:r>
+              <w:t>64 (11,6%)</w:t>
+            </w:r>
+          </w:p>
+        </w:tc>
+        <w:tc>
+          <w:p>
+            <w:pPr>
+              <w:pStyle w:val="Normal"/>
+            </w:pPr>
+            <w:r>
+              <w:t>65 (12,1%)</w:t>
+            </w:r>
+          </w:p>
+        </w:tc>
+        <w:tc>
+          <w:p>
+            <w:pPr>
+              <w:pStyle w:val="Normal"/>
+            </w:pPr>
+            <w:r>
+              <w:t>74 (12,5%)</w:t>
+            </w:r>
+          </w:p>
+        </w:tc>
+        <w:tc>
+          <w:p>
+            <w:pPr>
+              <w:pStyle w:val="Normal"/>
+            </w:pPr>
+            <w:r>
+              <w:t>70 (12,9%)</w:t>
+            </w:r>
+          </w:p>
+        </w:tc>
+        <w:tc>
+          <w:p>
+            <w:pPr>
+              <w:pStyle w:val="Normal"/>
+            </w:pPr>
+            <w:r>
+              <w:t>75 (13,7%)</w:t>
+            </w:r>
+          </w:p>
+        </w:tc>
+        <w:tc>
+          <w:p>
+            <w:pPr>
+              <w:pStyle w:val="Normal"/>
+            </w:pPr>
+            <w:r>
+              <w:t>66 (11,5%)</w:t>
+            </w:r>
+          </w:p>
+        </w:tc>
+        <w:tc>
+          <w:p>
+            <w:pPr>
+              <w:pStyle w:val="Normal"/>
+            </w:pPr>
+            <w:r>
+              <w:t>54 (10,6%)</w:t>
+            </w:r>
+          </w:p>
+        </w:tc>
+        <w:tc>
+          <w:p>
+            <w:pPr>
+              <w:pStyle w:val="Normal"/>
+            </w:pPr>
+            <w:r>
+              <w:t>62 (10,7%)</w:t>
             </w:r>
           </w:p>
         </w:tc>
@@ -945,87 +945,87 @@
               <w:pStyle w:val="Normal"/>
             </w:pPr>
             <w:r>
-              <w:t>6 (5,8%)</w:t>
-            </w:r>
-          </w:p>
-        </w:tc>
-        <w:tc>
-          <w:p>
-            <w:pPr>
-              <w:pStyle w:val="Normal"/>
-            </w:pPr>
-            <w:r>
-              <w:t>8 (7,0%)</w:t>
-            </w:r>
-          </w:p>
-        </w:tc>
-        <w:tc>
-          <w:p>
-            <w:pPr>
-              <w:pStyle w:val="Normal"/>
-            </w:pPr>
-            <w:r>
-              <w:t>5 (5,0%)</w:t>
-            </w:r>
-          </w:p>
-        </w:tc>
-        <w:tc>
-          <w:p>
-            <w:pPr>
-              <w:pStyle w:val="Normal"/>
-            </w:pPr>
-            <w:r>
-              <w:t>4 (3,8%)</w:t>
-            </w:r>
-          </w:p>
-        </w:tc>
-        <w:tc>
-          <w:p>
-            <w:pPr>
-              <w:pStyle w:val="Normal"/>
-            </w:pPr>
-            <w:r>
-              <w:t>1 (1,1%)</w:t>
-            </w:r>
-          </w:p>
-        </w:tc>
-        <w:tc>
-          <w:p>
-            <w:pPr>
-              <w:pStyle w:val="Normal"/>
-            </w:pPr>
-            <w:r>
-              <w:t>5 (5,4%)</w:t>
-            </w:r>
-          </w:p>
-        </w:tc>
-        <w:tc>
-          <w:p>
-            <w:pPr>
-              <w:pStyle w:val="Normal"/>
-            </w:pPr>
-            <w:r>
-              <w:t>6 (6,4%)</w:t>
-            </w:r>
-          </w:p>
-        </w:tc>
-        <w:tc>
-          <w:p>
-            <w:pPr>
-              <w:pStyle w:val="Normal"/>
-            </w:pPr>
-            <w:r>
-              <w:t>5 (5,5%)</w:t>
-            </w:r>
-          </w:p>
-        </w:tc>
-        <w:tc>
-          <w:p>
-            <w:pPr>
-              <w:pStyle w:val="Normal"/>
-            </w:pPr>
-            <w:r>
-              <w:t>6 (6,3%)</w:t>
+              <w:t>23 (4,1%)</w:t>
+            </w:r>
+          </w:p>
+        </w:tc>
+        <w:tc>
+          <w:p>
+            <w:pPr>
+              <w:pStyle w:val="Normal"/>
+            </w:pPr>
+            <w:r>
+              <w:t>27 (4,9%)</w:t>
+            </w:r>
+          </w:p>
+        </w:tc>
+        <w:tc>
+          <w:p>
+            <w:pPr>
+              <w:pStyle w:val="Normal"/>
+            </w:pPr>
+            <w:r>
+              <w:t>25 (4,7%)</w:t>
+            </w:r>
+          </w:p>
+        </w:tc>
+        <w:tc>
+          <w:p>
+            <w:pPr>
+              <w:pStyle w:val="Normal"/>
+            </w:pPr>
+            <w:r>
+              <w:t>31 (5,3%)</w:t>
+            </w:r>
+          </w:p>
+        </w:tc>
+        <w:tc>
+          <w:p>
+            <w:pPr>
+              <w:pStyle w:val="Normal"/>
+            </w:pPr>
+            <w:r>
+              <w:t>21 (3,9%)</w:t>
+            </w:r>
+          </w:p>
+        </w:tc>
+        <w:tc>
+          <w:p>
+            <w:pPr>
+              <w:pStyle w:val="Normal"/>
+            </w:pPr>
+            <w:r>
+              <w:t>28 (5,1%)</w:t>
+            </w:r>
+          </w:p>
+        </w:tc>
+        <w:tc>
+          <w:p>
+            <w:pPr>
+              <w:pStyle w:val="Normal"/>
+            </w:pPr>
+            <w:r>
+              <w:t>37 (6,4%)</w:t>
+            </w:r>
+          </w:p>
+        </w:tc>
+        <w:tc>
+          <w:p>
+            <w:pPr>
+              <w:pStyle w:val="Normal"/>
+            </w:pPr>
+            <w:r>
+              <w:t>29 (5,7%)</w:t>
+            </w:r>
+          </w:p>
+        </w:tc>
+        <w:tc>
+          <w:p>
+            <w:pPr>
+              <w:pStyle w:val="Normal"/>
+            </w:pPr>
+            <w:r>
+              <w:t>25 (4,3%)</w:t>
             </w:r>
           </w:p>
         </w:tc>
@@ -1047,87 +1047,87 @@
               <w:pStyle w:val="Normal"/>
             </w:pPr>
             <w:r>
-              <w:t>46 (44,2%)</w:t>
-            </w:r>
-          </w:p>
-        </w:tc>
-        <w:tc>
-          <w:p>
-            <w:pPr>
-              <w:pStyle w:val="Normal"/>
-            </w:pPr>
-            <w:r>
-              <w:t>55 (47,8%)</w:t>
-            </w:r>
-          </w:p>
-        </w:tc>
-        <w:tc>
-          <w:p>
-            <w:pPr>
-              <w:pStyle w:val="Normal"/>
-            </w:pPr>
-            <w:r>
-              <w:t>49 (49,0%)</w:t>
-            </w:r>
-          </w:p>
-        </w:tc>
-        <w:tc>
-          <w:p>
-            <w:pPr>
-              <w:pStyle w:val="Normal"/>
-            </w:pPr>
-            <w:r>
-              <w:t>45 (42,5%)</w:t>
-            </w:r>
-          </w:p>
-        </w:tc>
-        <w:tc>
-          <w:p>
-            <w:pPr>
-              <w:pStyle w:val="Normal"/>
-            </w:pPr>
-            <w:r>
-              <w:t>43 (48,9%)</w:t>
-            </w:r>
-          </w:p>
-        </w:tc>
-        <w:tc>
-          <w:p>
-            <w:pPr>
-              <w:pStyle w:val="Normal"/>
-            </w:pPr>
-            <w:r>
-              <w:t>45 (48,4%)</w:t>
-            </w:r>
-          </w:p>
-        </w:tc>
-        <w:tc>
-          <w:p>
-            <w:pPr>
-              <w:pStyle w:val="Normal"/>
-            </w:pPr>
-            <w:r>
-              <w:t>46 (48,9%)</w:t>
-            </w:r>
-          </w:p>
-        </w:tc>
-        <w:tc>
-          <w:p>
-            <w:pPr>
-              <w:pStyle w:val="Normal"/>
-            </w:pPr>
-            <w:r>
-              <w:t>45 (49,5%)</w:t>
-            </w:r>
-          </w:p>
-        </w:tc>
-        <w:tc>
-          <w:p>
-            <w:pPr>
-              <w:pStyle w:val="Normal"/>
-            </w:pPr>
-            <w:r>
-              <w:t>45 (47,4%)</w:t>
+              <w:t>291 (51,5%)</w:t>
+            </w:r>
+          </w:p>
+        </w:tc>
+        <w:tc>
+          <w:p>
+            <w:pPr>
+              <w:pStyle w:val="Normal"/>
+            </w:pPr>
+            <w:r>
+              <w:t>289 (52,5%)</w:t>
+            </w:r>
+          </w:p>
+        </w:tc>
+        <w:tc>
+          <w:p>
+            <w:pPr>
+              <w:pStyle w:val="Normal"/>
+            </w:pPr>
+            <w:r>
+              <w:t>284 (53,0%)</w:t>
+            </w:r>
+          </w:p>
+        </w:tc>
+        <w:tc>
+          <w:p>
+            <w:pPr>
+              <w:pStyle w:val="Normal"/>
+            </w:pPr>
+            <w:r>
+              <w:t>282 (47,8%)</w:t>
+            </w:r>
+          </w:p>
+        </w:tc>
+        <w:tc>
+          <w:p>
+            <w:pPr>
+              <w:pStyle w:val="Normal"/>
+            </w:pPr>
+            <w:r>
+              <w:t>254 (46,7%)</w:t>
+            </w:r>
+          </w:p>
+        </w:tc>
+        <w:tc>
+          <w:p>
+            <w:pPr>
+              <w:pStyle w:val="Normal"/>
+            </w:pPr>
+            <w:r>
+              <w:t>271 (49,5%)</w:t>
+            </w:r>
+          </w:p>
+        </w:tc>
+        <w:tc>
+          <w:p>
+            <w:pPr>
+              <w:pStyle w:val="Normal"/>
+            </w:pPr>
+            <w:r>
+              <w:t>282 (49,1%)</w:t>
+            </w:r>
+          </w:p>
+        </w:tc>
+        <w:tc>
+          <w:p>
+            <w:pPr>
+              <w:pStyle w:val="Normal"/>
+            </w:pPr>
+            <w:r>
+              <w:t>242 (47,4%)</w:t>
+            </w:r>
+          </w:p>
+        </w:tc>
+        <w:tc>
+          <w:p>
+            <w:pPr>
+              <w:pStyle w:val="Normal"/>
+            </w:pPr>
+            <w:r>
+              <w:t>298 (51,2%)</w:t>
             </w:r>
           </w:p>
         </w:tc>
@@ -1150,87 +1150,87 @@
               <w:pStyle w:val="Normal"/>
             </w:pPr>
             <w:r>
-              <w:t>74 (71,2%)</w:t>
-            </w:r>
-          </w:p>
-        </w:tc>
-        <w:tc>
-          <w:p>
-            <w:pPr>
-              <w:pStyle w:val="Normal"/>
-            </w:pPr>
-            <w:r>
-              <w:t>82 (71,3%)</w:t>
-            </w:r>
-          </w:p>
-        </w:tc>
-        <w:tc>
-          <w:p>
-            <w:pPr>
-              <w:pStyle w:val="Normal"/>
-            </w:pPr>
-            <w:r>
-              <w:t>61 (61,0%)</w:t>
-            </w:r>
-          </w:p>
-        </w:tc>
-        <w:tc>
-          <w:p>
-            <w:pPr>
-              <w:pStyle w:val="Normal"/>
-            </w:pPr>
-            <w:r>
-              <w:t>71 (67,0%)</w:t>
-            </w:r>
-          </w:p>
-        </w:tc>
-        <w:tc>
-          <w:p>
-            <w:pPr>
-              <w:pStyle w:val="Normal"/>
-            </w:pPr>
-            <w:r>
-              <w:t>63 (71,6%)</w:t>
-            </w:r>
-          </w:p>
-        </w:tc>
-        <w:tc>
-          <w:p>
-            <w:pPr>
-              <w:pStyle w:val="Normal"/>
-            </w:pPr>
-            <w:r>
-              <w:t>59 (63,4%)</w:t>
-            </w:r>
-          </w:p>
-        </w:tc>
-        <w:tc>
-          <w:p>
-            <w:pPr>
-              <w:pStyle w:val="Normal"/>
-            </w:pPr>
-            <w:r>
-              <w:t>64 (68,1%)</w:t>
-            </w:r>
-          </w:p>
-        </w:tc>
-        <w:tc>
-          <w:p>
-            <w:pPr>
-              <w:pStyle w:val="Normal"/>
-            </w:pPr>
-            <w:r>
-              <w:t>55 (60,4%)</w:t>
-            </w:r>
-          </w:p>
-        </w:tc>
-        <w:tc>
-          <w:p>
-            <w:pPr>
-              <w:pStyle w:val="Normal"/>
-            </w:pPr>
-            <w:r>
-              <w:t>71 (74,7%)</w:t>
+              <w:t>379 (67,1%)</w:t>
+            </w:r>
+          </w:p>
+        </w:tc>
+        <w:tc>
+          <w:p>
+            <w:pPr>
+              <w:pStyle w:val="Normal"/>
+            </w:pPr>
+            <w:r>
+              <w:t>375 (68,2%)</w:t>
+            </w:r>
+          </w:p>
+        </w:tc>
+        <w:tc>
+          <w:p>
+            <w:pPr>
+              <w:pStyle w:val="Normal"/>
+            </w:pPr>
+            <w:r>
+              <w:t>374 (69,8%)</w:t>
+            </w:r>
+          </w:p>
+        </w:tc>
+        <w:tc>
+          <w:p>
+            <w:pPr>
+              <w:pStyle w:val="Normal"/>
+            </w:pPr>
+            <w:r>
+              <w:t>402 (68,1%)</w:t>
+            </w:r>
+          </w:p>
+        </w:tc>
+        <w:tc>
+          <w:p>
+            <w:pPr>
+              <w:pStyle w:val="Normal"/>
+            </w:pPr>
+            <w:r>
+              <w:t>366 (67,3%)</w:t>
+            </w:r>
+          </w:p>
+        </w:tc>
+        <w:tc>
+          <w:p>
+            <w:pPr>
+              <w:pStyle w:val="Normal"/>
+            </w:pPr>
+            <w:r>
+              <w:t>362 (66,1%)</w:t>
+            </w:r>
+          </w:p>
+        </w:tc>
+        <w:tc>
+          <w:p>
+            <w:pPr>
+              <w:pStyle w:val="Normal"/>
+            </w:pPr>
+            <w:r>
+              <w:t>398 (69,3%)</w:t>
+            </w:r>
+          </w:p>
+        </w:tc>
+        <w:tc>
+          <w:p>
+            <w:pPr>
+              <w:pStyle w:val="Normal"/>
+            </w:pPr>
+            <w:r>
+              <w:t>338 (66,1%)</w:t>
+            </w:r>
+          </w:p>
+        </w:tc>
+        <w:tc>
+          <w:p>
+            <w:pPr>
+              <w:pStyle w:val="Normal"/>
+            </w:pPr>
+            <w:r>
+              <w:t>422 (72,5%)</w:t>
             </w:r>
           </w:p>
         </w:tc>
@@ -1253,87 +1253,87 @@
               <w:pStyle w:val="Normal"/>
             </w:pPr>
             <w:r>
-              <w:t>7 (6,7%)</w:t>
-            </w:r>
-          </w:p>
-        </w:tc>
-        <w:tc>
-          <w:p>
-            <w:pPr>
-              <w:pStyle w:val="Normal"/>
-            </w:pPr>
-            <w:r>
-              <w:t>11 (9,6%)</w:t>
-            </w:r>
-          </w:p>
-        </w:tc>
-        <w:tc>
-          <w:p>
-            <w:pPr>
-              <w:pStyle w:val="Normal"/>
-            </w:pPr>
-            <w:r>
-              <w:t>11 (11,0%)</w:t>
-            </w:r>
-          </w:p>
-        </w:tc>
-        <w:tc>
-          <w:p>
-            <w:pPr>
-              <w:pStyle w:val="Normal"/>
-            </w:pPr>
-            <w:r>
-              <w:t>14 (13,2%)</w:t>
-            </w:r>
-          </w:p>
-        </w:tc>
-        <w:tc>
-          <w:p>
-            <w:pPr>
-              <w:pStyle w:val="Normal"/>
-            </w:pPr>
-            <w:r>
-              <w:t>4 (4,5%)</w:t>
-            </w:r>
-          </w:p>
-        </w:tc>
-        <w:tc>
-          <w:p>
-            <w:pPr>
-              <w:pStyle w:val="Normal"/>
-            </w:pPr>
-            <w:r>
-              <w:t>4 (4,3%)</w:t>
-            </w:r>
-          </w:p>
-        </w:tc>
-        <w:tc>
-          <w:p>
-            <w:pPr>
-              <w:pStyle w:val="Normal"/>
-            </w:pPr>
-            <w:r>
-              <w:t>10 (10,6%)</w:t>
-            </w:r>
-          </w:p>
-        </w:tc>
-        <w:tc>
-          <w:p>
-            <w:pPr>
-              <w:pStyle w:val="Normal"/>
-            </w:pPr>
-            <w:r>
-              <w:t>11 (12,1%)</w:t>
-            </w:r>
-          </w:p>
-        </w:tc>
-        <w:tc>
-          <w:p>
-            <w:pPr>
-              <w:pStyle w:val="Normal"/>
-            </w:pPr>
-            <w:r>
-              <w:t>5 (5,3%)</w:t>
+              <w:t>49 (8,7%)</w:t>
+            </w:r>
+          </w:p>
+        </w:tc>
+        <w:tc>
+          <w:p>
+            <w:pPr>
+              <w:pStyle w:val="Normal"/>
+            </w:pPr>
+            <w:r>
+              <w:t>38 (6,9%)</w:t>
+            </w:r>
+          </w:p>
+        </w:tc>
+        <w:tc>
+          <w:p>
+            <w:pPr>
+              <w:pStyle w:val="Normal"/>
+            </w:pPr>
+            <w:r>
+              <w:t>42 (7,8%)</w:t>
+            </w:r>
+          </w:p>
+        </w:tc>
+        <w:tc>
+          <w:p>
+            <w:pPr>
+              <w:pStyle w:val="Normal"/>
+            </w:pPr>
+            <w:r>
+              <w:t>54 (9,2%)</w:t>
+            </w:r>
+          </w:p>
+        </w:tc>
+        <w:tc>
+          <w:p>
+            <w:pPr>
+              <w:pStyle w:val="Normal"/>
+            </w:pPr>
+            <w:r>
+              <w:t>44 (8,1%)</w:t>
+            </w:r>
+          </w:p>
+        </w:tc>
+        <w:tc>
+          <w:p>
+            <w:pPr>
+              <w:pStyle w:val="Normal"/>
+            </w:pPr>
+            <w:r>
+              <w:t>48 (8,8%)</w:t>
+            </w:r>
+          </w:p>
+        </w:tc>
+        <w:tc>
+          <w:p>
+            <w:pPr>
+              <w:pStyle w:val="Normal"/>
+            </w:pPr>
+            <w:r>
+              <w:t>58 (10,1%)</w:t>
+            </w:r>
+          </w:p>
+        </w:tc>
+        <w:tc>
+          <w:p>
+            <w:pPr>
+              <w:pStyle w:val="Normal"/>
+            </w:pPr>
+            <w:r>
+              <w:t>44 (8,6%)</w:t>
+            </w:r>
+          </w:p>
+        </w:tc>
+        <w:tc>
+          <w:p>
+            <w:pPr>
+              <w:pStyle w:val="Normal"/>
+            </w:pPr>
+            <w:r>
+              <w:t>45 (7,7%)</w:t>
             </w:r>
           </w:p>
         </w:tc>
@@ -1457,87 +1457,87 @@
               <w:pStyle w:val="Normal"/>
             </w:pPr>
             <w:r>
-              <w:t>43 (41,3%)</w:t>
-            </w:r>
-          </w:p>
-        </w:tc>
-        <w:tc>
-          <w:p>
-            <w:pPr>
-              <w:pStyle w:val="Normal"/>
-            </w:pPr>
-            <w:r>
-              <w:t>43 (37,4%)</w:t>
-            </w:r>
-          </w:p>
-        </w:tc>
-        <w:tc>
-          <w:p>
-            <w:pPr>
-              <w:pStyle w:val="Normal"/>
-            </w:pPr>
-            <w:r>
-              <w:t>42 (42,0%)</w:t>
-            </w:r>
-          </w:p>
-        </w:tc>
-        <w:tc>
-          <w:p>
-            <w:pPr>
-              <w:pStyle w:val="Normal"/>
-            </w:pPr>
-            <w:r>
-              <w:t>42 (39,6%)</w:t>
-            </w:r>
-          </w:p>
-        </w:tc>
-        <w:tc>
-          <w:p>
-            <w:pPr>
-              <w:pStyle w:val="Normal"/>
-            </w:pPr>
-            <w:r>
-              <w:t>34 (38,6%)</w:t>
-            </w:r>
-          </w:p>
-        </w:tc>
-        <w:tc>
-          <w:p>
-            <w:pPr>
-              <w:pStyle w:val="Normal"/>
-            </w:pPr>
-            <w:r>
-              <w:t>35 (37,6%)</w:t>
-            </w:r>
-          </w:p>
-        </w:tc>
-        <w:tc>
-          <w:p>
-            <w:pPr>
-              <w:pStyle w:val="Normal"/>
-            </w:pPr>
-            <w:r>
-              <w:t>35 (37,2%)</w:t>
-            </w:r>
-          </w:p>
-        </w:tc>
-        <w:tc>
-          <w:p>
-            <w:pPr>
-              <w:pStyle w:val="Normal"/>
-            </w:pPr>
-            <w:r>
-              <w:t>33 (36,3%)</w:t>
-            </w:r>
-          </w:p>
-        </w:tc>
-        <w:tc>
-          <w:p>
-            <w:pPr>
-              <w:pStyle w:val="Normal"/>
-            </w:pPr>
-            <w:r>
-              <w:t>45 (47,4%)</w:t>
+              <w:t>235 (41,6%)</w:t>
+            </w:r>
+          </w:p>
+        </w:tc>
+        <w:tc>
+          <w:p>
+            <w:pPr>
+              <w:pStyle w:val="Normal"/>
+            </w:pPr>
+            <w:r>
+              <w:t>230 (41,8%)</w:t>
+            </w:r>
+          </w:p>
+        </w:tc>
+        <w:tc>
+          <w:p>
+            <w:pPr>
+              <w:pStyle w:val="Normal"/>
+            </w:pPr>
+            <w:r>
+              <w:t>221 (41,2%)</w:t>
+            </w:r>
+          </w:p>
+        </w:tc>
+        <w:tc>
+          <w:p>
+            <w:pPr>
+              <w:pStyle w:val="Normal"/>
+            </w:pPr>
+            <w:r>
+              <w:t>232 (39,3%)</w:t>
+            </w:r>
+          </w:p>
+        </w:tc>
+        <w:tc>
+          <w:p>
+            <w:pPr>
+              <w:pStyle w:val="Normal"/>
+            </w:pPr>
+            <w:r>
+              <w:t>212 (39,0%)</w:t>
+            </w:r>
+          </w:p>
+        </w:tc>
+        <w:tc>
+          <w:p>
+            <w:pPr>
+              <w:pStyle w:val="Normal"/>
+            </w:pPr>
+            <w:r>
+              <w:t>212 (38,7%)</w:t>
+            </w:r>
+          </w:p>
+        </w:tc>
+        <w:tc>
+          <w:p>
+            <w:pPr>
+              <w:pStyle w:val="Normal"/>
+            </w:pPr>
+            <w:r>
+              <w:t>242 (42,2%)</w:t>
+            </w:r>
+          </w:p>
+        </w:tc>
+        <w:tc>
+          <w:p>
+            <w:pPr>
+              <w:pStyle w:val="Normal"/>
+            </w:pPr>
+            <w:r>
+              <w:t>232 (45,4%)</w:t>
+            </w:r>
+          </w:p>
+        </w:tc>
+        <w:tc>
+          <w:p>
+            <w:pPr>
+              <w:pStyle w:val="Normal"/>
+            </w:pPr>
+            <w:r>
+              <w:t>222 (38,1%)</w:t>
             </w:r>
           </w:p>
         </w:tc>
@@ -1559,87 +1559,87 @@
               <w:pStyle w:val="Normal"/>
             </w:pPr>
             <w:r>
-              <w:t>16 (15,4%)</w:t>
-            </w:r>
-          </w:p>
-        </w:tc>
-        <w:tc>
-          <w:p>
-            <w:pPr>
-              <w:pStyle w:val="Normal"/>
-            </w:pPr>
-            <w:r>
-              <w:t>16 (13,9%)</w:t>
-            </w:r>
-          </w:p>
-        </w:tc>
-        <w:tc>
-          <w:p>
-            <w:pPr>
-              <w:pStyle w:val="Normal"/>
-            </w:pPr>
-            <w:r>
-              <w:t>17 (17,0%)</w:t>
-            </w:r>
-          </w:p>
-        </w:tc>
-        <w:tc>
-          <w:p>
-            <w:pPr>
-              <w:pStyle w:val="Normal"/>
-            </w:pPr>
-            <w:r>
-              <w:t>15 (14,2%)</w:t>
-            </w:r>
-          </w:p>
-        </w:tc>
-        <w:tc>
-          <w:p>
-            <w:pPr>
-              <w:pStyle w:val="Normal"/>
-            </w:pPr>
-            <w:r>
-              <w:t>15 (17,0%)</w:t>
-            </w:r>
-          </w:p>
-        </w:tc>
-        <w:tc>
-          <w:p>
-            <w:pPr>
-              <w:pStyle w:val="Normal"/>
-            </w:pPr>
-            <w:r>
-              <w:t>9 (9,7%)</w:t>
-            </w:r>
-          </w:p>
-        </w:tc>
-        <w:tc>
-          <w:p>
-            <w:pPr>
-              <w:pStyle w:val="Normal"/>
-            </w:pPr>
-            <w:r>
-              <w:t>10 (10,6%)</w:t>
-            </w:r>
-          </w:p>
-        </w:tc>
-        <w:tc>
-          <w:p>
-            <w:pPr>
-              <w:pStyle w:val="Normal"/>
-            </w:pPr>
-            <w:r>
-              <w:t>9 (9,9%)</w:t>
-            </w:r>
-          </w:p>
-        </w:tc>
-        <w:tc>
-          <w:p>
-            <w:pPr>
-              <w:pStyle w:val="Normal"/>
-            </w:pPr>
-            <w:r>
-              <w:t>14 (14,7%)</w:t>
+              <w:t>96 (17,0%)</w:t>
+            </w:r>
+          </w:p>
+        </w:tc>
+        <w:tc>
+          <w:p>
+            <w:pPr>
+              <w:pStyle w:val="Normal"/>
+            </w:pPr>
+            <w:r>
+              <w:t>82 (14,9%)</w:t>
+            </w:r>
+          </w:p>
+        </w:tc>
+        <w:tc>
+          <w:p>
+            <w:pPr>
+              <w:pStyle w:val="Normal"/>
+            </w:pPr>
+            <w:r>
+              <w:t>72 (13,4%)</w:t>
+            </w:r>
+          </w:p>
+        </w:tc>
+        <w:tc>
+          <w:p>
+            <w:pPr>
+              <w:pStyle w:val="Normal"/>
+            </w:pPr>
+            <w:r>
+              <w:t>82 (13,9%)</w:t>
+            </w:r>
+          </w:p>
+        </w:tc>
+        <w:tc>
+          <w:p>
+            <w:pPr>
+              <w:pStyle w:val="Normal"/>
+            </w:pPr>
+            <w:r>
+              <w:t>76 (14,0%)</w:t>
+            </w:r>
+          </w:p>
+        </w:tc>
+        <w:tc>
+          <w:p>
+            <w:pPr>
+              <w:pStyle w:val="Normal"/>
+            </w:pPr>
+            <w:r>
+              <w:t>67 (12,2%)</w:t>
+            </w:r>
+          </w:p>
+        </w:tc>
+        <w:tc>
+          <w:p>
+            <w:pPr>
+              <w:pStyle w:val="Normal"/>
+            </w:pPr>
+            <w:r>
+              <w:t>89 (15,5%)</w:t>
+            </w:r>
+          </w:p>
+        </w:tc>
+        <w:tc>
+          <w:p>
+            <w:pPr>
+              <w:pStyle w:val="Normal"/>
+            </w:pPr>
+            <w:r>
+              <w:t>71 (13,9%)</w:t>
+            </w:r>
+          </w:p>
+        </w:tc>
+        <w:tc>
+          <w:p>
+            <w:pPr>
+              <w:pStyle w:val="Normal"/>
+            </w:pPr>
+            <w:r>
+              <w:t>77 (13,2%)</w:t>
             </w:r>
           </w:p>
         </w:tc>
@@ -1661,87 +1661,87 @@
               <w:pStyle w:val="Normal"/>
             </w:pPr>
             <w:r>
-              <w:t>85 (81,7%)</w:t>
-            </w:r>
-          </w:p>
-        </w:tc>
-        <w:tc>
-          <w:p>
-            <w:pPr>
-              <w:pStyle w:val="Normal"/>
-            </w:pPr>
-            <w:r>
-              <w:t>92 (80,0%)</w:t>
-            </w:r>
-          </w:p>
-        </w:tc>
-        <w:tc>
-          <w:p>
-            <w:pPr>
-              <w:pStyle w:val="Normal"/>
-            </w:pPr>
-            <w:r>
-              <w:t>87 (87,0%)</w:t>
-            </w:r>
-          </w:p>
-        </w:tc>
-        <w:tc>
-          <w:p>
-            <w:pPr>
-              <w:pStyle w:val="Normal"/>
-            </w:pPr>
-            <w:r>
-              <w:t>96 (90,6%)</w:t>
-            </w:r>
-          </w:p>
-        </w:tc>
-        <w:tc>
-          <w:p>
-            <w:pPr>
-              <w:pStyle w:val="Normal"/>
-            </w:pPr>
-            <w:r>
-              <w:t>78 (88,6%)</w:t>
-            </w:r>
-          </w:p>
-        </w:tc>
-        <w:tc>
-          <w:p>
-            <w:pPr>
-              <w:pStyle w:val="Normal"/>
-            </w:pPr>
-            <w:r>
-              <w:t>75 (80,6%)</w:t>
-            </w:r>
-          </w:p>
-        </w:tc>
-        <w:tc>
-          <w:p>
-            <w:pPr>
-              <w:pStyle w:val="Normal"/>
-            </w:pPr>
-            <w:r>
-              <w:t>80 (85,1%)</w:t>
-            </w:r>
-          </w:p>
-        </w:tc>
-        <w:tc>
-          <w:p>
-            <w:pPr>
-              <w:pStyle w:val="Normal"/>
-            </w:pPr>
-            <w:r>
-              <w:t>76 (83,5%)</w:t>
-            </w:r>
-          </w:p>
-        </w:tc>
-        <w:tc>
-          <w:p>
-            <w:pPr>
-              <w:pStyle w:val="Normal"/>
-            </w:pPr>
-            <w:r>
-              <w:t>81 (85,3%)</w:t>
+              <w:t>476 (84,2%)</w:t>
+            </w:r>
+          </w:p>
+        </w:tc>
+        <w:tc>
+          <w:p>
+            <w:pPr>
+              <w:pStyle w:val="Normal"/>
+            </w:pPr>
+            <w:r>
+              <w:t>458 (83,3%)</w:t>
+            </w:r>
+          </w:p>
+        </w:tc>
+        <w:tc>
+          <w:p>
+            <w:pPr>
+              <w:pStyle w:val="Normal"/>
+            </w:pPr>
+            <w:r>
+              <w:t>462 (86,2%)</w:t>
+            </w:r>
+          </w:p>
+        </w:tc>
+        <w:tc>
+          <w:p>
+            <w:pPr>
+              <w:pStyle w:val="Normal"/>
+            </w:pPr>
+            <w:r>
+              <w:t>497 (84,2%)</w:t>
+            </w:r>
+          </w:p>
+        </w:tc>
+        <w:tc>
+          <w:p>
+            <w:pPr>
+              <w:pStyle w:val="Normal"/>
+            </w:pPr>
+            <w:r>
+              <w:t>467 (85,8%)</w:t>
+            </w:r>
+          </w:p>
+        </w:tc>
+        <w:tc>
+          <w:p>
+            <w:pPr>
+              <w:pStyle w:val="Normal"/>
+            </w:pPr>
+            <w:r>
+              <w:t>463 (84,5%)</w:t>
+            </w:r>
+          </w:p>
+        </w:tc>
+        <w:tc>
+          <w:p>
+            <w:pPr>
+              <w:pStyle w:val="Normal"/>
+            </w:pPr>
+            <w:r>
+              <w:t>478 (83,3%)</w:t>
+            </w:r>
+          </w:p>
+        </w:tc>
+        <w:tc>
+          <w:p>
+            <w:pPr>
+              <w:pStyle w:val="Normal"/>
+            </w:pPr>
+            <w:r>
+              <w:t>437 (85,5%)</w:t>
+            </w:r>
+          </w:p>
+        </w:tc>
+        <w:tc>
+          <w:p>
+            <w:pPr>
+              <w:pStyle w:val="Normal"/>
+            </w:pPr>
+            <w:r>
+              <w:t>486 (83,5%)</w:t>
             </w:r>
           </w:p>
         </w:tc>
@@ -1763,87 +1763,87 @@
               <w:pStyle w:val="Normal"/>
             </w:pPr>
             <w:r>
-              <w:t>88 (84,6%)</w:t>
-            </w:r>
-          </w:p>
-        </w:tc>
-        <w:tc>
-          <w:p>
-            <w:pPr>
-              <w:pStyle w:val="Normal"/>
-            </w:pPr>
-            <w:r>
-              <w:t>102 (88,7%)</w:t>
-            </w:r>
-          </w:p>
-        </w:tc>
-        <w:tc>
-          <w:p>
-            <w:pPr>
-              <w:pStyle w:val="Normal"/>
-            </w:pPr>
-            <w:r>
-              <w:t>86 (86,0%)</w:t>
-            </w:r>
-          </w:p>
-        </w:tc>
-        <w:tc>
-          <w:p>
-            <w:pPr>
-              <w:pStyle w:val="Normal"/>
-            </w:pPr>
-            <w:r>
-              <w:t>88 (83,0%)</w:t>
-            </w:r>
-          </w:p>
-        </w:tc>
-        <w:tc>
-          <w:p>
-            <w:pPr>
-              <w:pStyle w:val="Normal"/>
-            </w:pPr>
-            <w:r>
-              <w:t>79 (89,8%)</w:t>
-            </w:r>
-          </w:p>
-        </w:tc>
-        <w:tc>
-          <w:p>
-            <w:pPr>
-              <w:pStyle w:val="Normal"/>
-            </w:pPr>
-            <w:r>
-              <w:t>81 (87,1%)</w:t>
-            </w:r>
-          </w:p>
-        </w:tc>
-        <w:tc>
-          <w:p>
-            <w:pPr>
-              <w:pStyle w:val="Normal"/>
-            </w:pPr>
-            <w:r>
-              <w:t>78 (83,0%)</w:t>
-            </w:r>
-          </w:p>
-        </w:tc>
-        <w:tc>
-          <w:p>
-            <w:pPr>
-              <w:pStyle w:val="Normal"/>
-            </w:pPr>
-            <w:r>
-              <w:t>79 (86,8%)</w:t>
-            </w:r>
-          </w:p>
-        </w:tc>
-        <w:tc>
-          <w:p>
-            <w:pPr>
-              <w:pStyle w:val="Normal"/>
-            </w:pPr>
-            <w:r>
-              <w:t>79 (83,2%)</w:t>
+              <w:t>483 (85,5%)</w:t>
+            </w:r>
+          </w:p>
+        </w:tc>
+        <w:tc>
+          <w:p>
+            <w:pPr>
+              <w:pStyle w:val="Normal"/>
+            </w:pPr>
+            <w:r>
+              <w:t>472 (85,8%)</w:t>
+            </w:r>
+          </w:p>
+        </w:tc>
+        <w:tc>
+          <w:p>
+            <w:pPr>
+              <w:pStyle w:val="Normal"/>
+            </w:pPr>
+            <w:r>
+              <w:t>454 (84,7%)</w:t>
+            </w:r>
+          </w:p>
+        </w:tc>
+        <w:tc>
+          <w:p>
+            <w:pPr>
+              <w:pStyle w:val="Normal"/>
+            </w:pPr>
+            <w:r>
+              <w:t>503 (85,3%)</w:t>
+            </w:r>
+          </w:p>
+        </w:tc>
+        <w:tc>
+          <w:p>
+            <w:pPr>
+              <w:pStyle w:val="Normal"/>
+            </w:pPr>
+            <w:r>
+              <w:t>460 (84,6%)</w:t>
+            </w:r>
+          </w:p>
+        </w:tc>
+        <w:tc>
+          <w:p>
+            <w:pPr>
+              <w:pStyle w:val="Normal"/>
+            </w:pPr>
+            <w:r>
+              <w:t>464 (84,7%)</w:t>
+            </w:r>
+          </w:p>
+        </w:tc>
+        <w:tc>
+          <w:p>
+            <w:pPr>
+              <w:pStyle w:val="Normal"/>
+            </w:pPr>
+            <w:r>
+              <w:t>488 (85,0%)</w:t>
+            </w:r>
+          </w:p>
+        </w:tc>
+        <w:tc>
+          <w:p>
+            <w:pPr>
+              <w:pStyle w:val="Normal"/>
+            </w:pPr>
+            <w:r>
+              <w:t>424 (83,0%)</w:t>
+            </w:r>
+          </w:p>
+        </w:tc>
+        <w:tc>
+          <w:p>
+            <w:pPr>
+              <w:pStyle w:val="Normal"/>
+            </w:pPr>
+            <w:r>
+              <w:t>492 (84,5%)</w:t>
             </w:r>
           </w:p>
         </w:tc>
@@ -1865,87 +1865,87 @@
               <w:pStyle w:val="Normal"/>
             </w:pPr>
             <w:r>
-              <w:t>58 (55,8%)</w:t>
-            </w:r>
-          </w:p>
-        </w:tc>
-        <w:tc>
-          <w:p>
-            <w:pPr>
-              <w:pStyle w:val="Normal"/>
-            </w:pPr>
-            <w:r>
-              <w:t>51 (44,3%)</w:t>
-            </w:r>
-          </w:p>
-        </w:tc>
-        <w:tc>
-          <w:p>
-            <w:pPr>
-              <w:pStyle w:val="Normal"/>
-            </w:pPr>
-            <w:r>
-              <w:t>49 (49,0%)</w:t>
-            </w:r>
-          </w:p>
-        </w:tc>
-        <w:tc>
-          <w:p>
-            <w:pPr>
-              <w:pStyle w:val="Normal"/>
-            </w:pPr>
-            <w:r>
-              <w:t>56 (52,8%)</w:t>
-            </w:r>
-          </w:p>
-        </w:tc>
-        <w:tc>
-          <w:p>
-            <w:pPr>
-              <w:pStyle w:val="Normal"/>
-            </w:pPr>
-            <w:r>
-              <w:t>43 (48,9%)</w:t>
-            </w:r>
-          </w:p>
-        </w:tc>
-        <w:tc>
-          <w:p>
-            <w:pPr>
-              <w:pStyle w:val="Normal"/>
-            </w:pPr>
-            <w:r>
-              <w:t>53 (57,0%)</w:t>
-            </w:r>
-          </w:p>
-        </w:tc>
-        <w:tc>
-          <w:p>
-            <w:pPr>
-              <w:pStyle w:val="Normal"/>
-            </w:pPr>
-            <w:r>
-              <w:t>47 (50,0%)</w:t>
-            </w:r>
-          </w:p>
-        </w:tc>
-        <w:tc>
-          <w:p>
-            <w:pPr>
-              <w:pStyle w:val="Normal"/>
-            </w:pPr>
-            <w:r>
-              <w:t>44 (48,4%)</w:t>
-            </w:r>
-          </w:p>
-        </w:tc>
-        <w:tc>
-          <w:p>
-            <w:pPr>
-              <w:pStyle w:val="Normal"/>
-            </w:pPr>
-            <w:r>
-              <w:t>50 (52,6%)</w:t>
+              <w:t>299 (52,9%)</w:t>
+            </w:r>
+          </w:p>
+        </w:tc>
+        <w:tc>
+          <w:p>
+            <w:pPr>
+              <w:pStyle w:val="Normal"/>
+            </w:pPr>
+            <w:r>
+              <w:t>312 (56,7%)</w:t>
+            </w:r>
+          </w:p>
+        </w:tc>
+        <w:tc>
+          <w:p>
+            <w:pPr>
+              <w:pStyle w:val="Normal"/>
+            </w:pPr>
+            <w:r>
+              <w:t>284 (53,0%)</w:t>
+            </w:r>
+          </w:p>
+        </w:tc>
+        <w:tc>
+          <w:p>
+            <w:pPr>
+              <w:pStyle w:val="Normal"/>
+            </w:pPr>
+            <w:r>
+              <w:t>297 (50,3%)</w:t>
+            </w:r>
+          </w:p>
+        </w:tc>
+        <w:tc>
+          <w:p>
+            <w:pPr>
+              <w:pStyle w:val="Normal"/>
+            </w:pPr>
+            <w:r>
+              <w:t>287 (52,8%)</w:t>
+            </w:r>
+          </w:p>
+        </w:tc>
+        <w:tc>
+          <w:p>
+            <w:pPr>
+              <w:pStyle w:val="Normal"/>
+            </w:pPr>
+            <w:r>
+              <w:t>273 (49,8%)</w:t>
+            </w:r>
+          </w:p>
+        </w:tc>
+        <w:tc>
+          <w:p>
+            <w:pPr>
+              <w:pStyle w:val="Normal"/>
+            </w:pPr>
+            <w:r>
+              <w:t>304 (53,0%)</w:t>
+            </w:r>
+          </w:p>
+        </w:tc>
+        <w:tc>
+          <w:p>
+            <w:pPr>
+              <w:pStyle w:val="Normal"/>
+            </w:pPr>
+            <w:r>
+              <w:t>290 (56,8%)</w:t>
+            </w:r>
+          </w:p>
+        </w:tc>
+        <w:tc>
+          <w:p>
+            <w:pPr>
+              <w:pStyle w:val="Normal"/>
+            </w:pPr>
+            <w:r>
+              <w:t>314 (54,0%)</w:t>
             </w:r>
           </w:p>
         </w:tc>
@@ -1967,87 +1967,87 @@
               <w:pStyle w:val="Normal"/>
             </w:pPr>
             <w:r>
-              <w:t>15 (14,4%)</w:t>
-            </w:r>
-          </w:p>
-        </w:tc>
-        <w:tc>
-          <w:p>
-            <w:pPr>
-              <w:pStyle w:val="Normal"/>
-            </w:pPr>
-            <w:r>
-              <w:t>25 (21,7%)</w:t>
-            </w:r>
-          </w:p>
-        </w:tc>
-        <w:tc>
-          <w:p>
-            <w:pPr>
-              <w:pStyle w:val="Normal"/>
-            </w:pPr>
-            <w:r>
-              <w:t>15 (15,0%)</w:t>
-            </w:r>
-          </w:p>
-        </w:tc>
-        <w:tc>
-          <w:p>
-            <w:pPr>
-              <w:pStyle w:val="Normal"/>
-            </w:pPr>
-            <w:r>
-              <w:t>21 (19,8%)</w:t>
-            </w:r>
-          </w:p>
-        </w:tc>
-        <w:tc>
-          <w:p>
-            <w:pPr>
-              <w:pStyle w:val="Normal"/>
-            </w:pPr>
-            <w:r>
-              <w:t>19 (21,6%)</w:t>
-            </w:r>
-          </w:p>
-        </w:tc>
-        <w:tc>
-          <w:p>
-            <w:pPr>
-              <w:pStyle w:val="Normal"/>
-            </w:pPr>
-            <w:r>
-              <w:t>20 (21,5%)</w:t>
-            </w:r>
-          </w:p>
-        </w:tc>
-        <w:tc>
-          <w:p>
-            <w:pPr>
-              <w:pStyle w:val="Normal"/>
-            </w:pPr>
-            <w:r>
-              <w:t>20 (21,3%)</w:t>
-            </w:r>
-          </w:p>
-        </w:tc>
-        <w:tc>
-          <w:p>
-            <w:pPr>
-              <w:pStyle w:val="Normal"/>
-            </w:pPr>
-            <w:r>
-              <w:t>12 (13,2%)</w:t>
-            </w:r>
-          </w:p>
-        </w:tc>
-        <w:tc>
-          <w:p>
-            <w:pPr>
-              <w:pStyle w:val="Normal"/>
-            </w:pPr>
-            <w:r>
-              <w:t>14 (14,7%)</w:t>
+              <w:t>118 (20,9%)</w:t>
+            </w:r>
+          </w:p>
+        </w:tc>
+        <w:tc>
+          <w:p>
+            <w:pPr>
+              <w:pStyle w:val="Normal"/>
+            </w:pPr>
+            <w:r>
+              <w:t>109 (19,8%)</w:t>
+            </w:r>
+          </w:p>
+        </w:tc>
+        <w:tc>
+          <w:p>
+            <w:pPr>
+              <w:pStyle w:val="Normal"/>
+            </w:pPr>
+            <w:r>
+              <w:t>100 (18,7%)</w:t>
+            </w:r>
+          </w:p>
+        </w:tc>
+        <w:tc>
+          <w:p>
+            <w:pPr>
+              <w:pStyle w:val="Normal"/>
+            </w:pPr>
+            <w:r>
+              <w:t>105 (17,8%)</w:t>
+            </w:r>
+          </w:p>
+        </w:tc>
+        <w:tc>
+          <w:p>
+            <w:pPr>
+              <w:pStyle w:val="Normal"/>
+            </w:pPr>
+            <w:r>
+              <w:t>105 (19,3%)</w:t>
+            </w:r>
+          </w:p>
+        </w:tc>
+        <w:tc>
+          <w:p>
+            <w:pPr>
+              <w:pStyle w:val="Normal"/>
+            </w:pPr>
+            <w:r>
+              <w:t>94 (17,2%)</w:t>
+            </w:r>
+          </w:p>
+        </w:tc>
+        <w:tc>
+          <w:p>
+            <w:pPr>
+              <w:pStyle w:val="Normal"/>
+            </w:pPr>
+            <w:r>
+              <w:t>114 (19,9%)</w:t>
+            </w:r>
+          </w:p>
+        </w:tc>
+        <w:tc>
+          <w:p>
+            <w:pPr>
+              <w:pStyle w:val="Normal"/>
+            </w:pPr>
+            <w:r>
+              <w:t>88 (17,2%)</w:t>
+            </w:r>
+          </w:p>
+        </w:tc>
+        <w:tc>
+          <w:p>
+            <w:pPr>
+              <w:pStyle w:val="Normal"/>
+            </w:pPr>
+            <w:r>
+              <w:t>96 (16,5%)</w:t>
             </w:r>
           </w:p>
         </w:tc>

</xml_diff>